<commit_message>
Finalisation de l'infrastructure de streaming et mise à jour de la documentation
</commit_message>
<xml_diff>
--- a/Mahmoud_Amin_2_evaluation_compatibilite_102026.docx
+++ b/Mahmoud_Amin_2_evaluation_compatibilite_102026.docx
@@ -368,6 +368,45 @@
       <w:r>
         <w:t xml:space="preserve"> ingère et route le flux constant des données IoT sans intervention manuelle. </w:t>
       </w:r>
+      <w:r>
+        <w:t xml:space="preserve">Le chargement des données depuis Amazon S3 vers Amazon Redshift est automatisé via Amazon </w:t>
+      </w:r>
+      <w:proofErr w:type="spellStart"/>
+      <w:r>
+        <w:t>EventBridge</w:t>
+      </w:r>
+      <w:proofErr w:type="spellEnd"/>
+      <w:r>
+        <w:t xml:space="preserve"> ou des notifications d'événements S3. Dès qu'un nouveau fichier atterrit dans le </w:t>
+      </w:r>
+      <w:proofErr w:type="spellStart"/>
+      <w:r>
+        <w:t>bucket</w:t>
+      </w:r>
+      <w:proofErr w:type="spellEnd"/>
+      <w:r>
+        <w:t xml:space="preserve"> S3, un événement déclenche une fonction AWS Lambda qui exécute la commande SQL COPY dans Redshift. Pour les mises à jour (</w:t>
+      </w:r>
+      <w:proofErr w:type="spellStart"/>
+      <w:r>
+        <w:t>Upsert</w:t>
+      </w:r>
+      <w:proofErr w:type="spellEnd"/>
+      <w:r>
+        <w:t xml:space="preserve">), on utilise une </w:t>
+      </w:r>
+      <w:r>
+        <w:lastRenderedPageBreak/>
+        <w:t xml:space="preserve">table de </w:t>
+      </w:r>
+      <w:proofErr w:type="spellStart"/>
+      <w:r>
+        <w:t>staging</w:t>
+      </w:r>
+      <w:proofErr w:type="spellEnd"/>
+      <w:r>
+        <w:t xml:space="preserve"> dans Redshift pour dédoublonner et mettre à jour la table finale afin de refléter les changements sans dupliquer les données.</w:t>
+      </w:r>
     </w:p>
     <w:p>
       <w:pPr>
@@ -390,11 +429,7 @@
         <w:ind w:left="360"/>
       </w:pPr>
       <w:r>
-        <w:t xml:space="preserve">La scalabilité de l'architecture cloud est démontrée par sa capacité à absorber l'augmentation de 50 Go/mois de données IoT en temps réel. L'utilisation d'Amazon </w:t>
-      </w:r>
-      <w:r>
-        <w:lastRenderedPageBreak/>
-        <w:t xml:space="preserve">S3 comme Data Lake offre un stockage d'objets virtuellement illimité, permettant de désengorger définitivement la baie de stockage SAN locale de 10 To. Du côté analytique, Amazon Redshift permet d'ajuster dynamiquement la taille du cluster (scale-up ou scale-out) pour traiter efficacement les 40 To de données critiques issues du SQL Server, garantissant des performances constantes même si le volume de données double dans les prochaines années. </w:t>
+        <w:t xml:space="preserve">La scalabilité de l'architecture cloud est démontrée par sa capacité à absorber l'augmentation de 50 Go/mois de données IoT en temps réel. L'utilisation d'Amazon S3 comme Data Lake offre un stockage d'objets virtuellement illimité, permettant de désengorger définitivement la baie de stockage SAN locale de 10 To. Du côté analytique, Amazon Redshift permet d'ajuster dynamiquement la taille du cluster (scale-up ou scale-out) pour traiter efficacement les 40 To de données critiques issues du SQL Server, garantissant des performances constantes même si le volume de données double dans les prochaines années. </w:t>
       </w:r>
     </w:p>
     <w:p>
@@ -1440,7 +1475,6 @@
                 <w:szCs w:val="20"/>
               </w:rPr>
             </w:pPr>
-            <w:proofErr w:type="gramStart"/>
             <w:r>
               <w:rPr>
                 <w:i/>
@@ -1449,9 +1483,8 @@
                 <w:szCs w:val="20"/>
                 <w:lang w:val="en-GB"/>
               </w:rPr>
-              <w:t>Stockage :</w:t>
-            </w:r>
-            <w:proofErr w:type="gramEnd"/>
+              <w:t xml:space="preserve">Stockage : ~50 000 Go (10 To SAN + 40 To staging </w:t>
+            </w:r>
             <w:r>
               <w:rPr>
                 <w:i/>
@@ -1460,7 +1493,8 @@
                 <w:szCs w:val="20"/>
                 <w:lang w:val="en-GB"/>
               </w:rPr>
-              <w:t xml:space="preserve"> ~50 000 Go (10 To SAN + 40 To staging DMS). </w:t>
+              <w:lastRenderedPageBreak/>
+              <w:t xml:space="preserve">DMS). </w:t>
             </w:r>
             <w:r>
               <w:rPr>
@@ -1512,6 +1546,7 @@
                 <w:sz w:val="22"/>
                 <w:szCs w:val="22"/>
               </w:rPr>
+              <w:lastRenderedPageBreak/>
               <w:t>1</w:t>
             </w:r>
             <w:r>
@@ -1753,37 +1788,7 @@
                 <w:sz w:val="20"/>
                 <w:szCs w:val="20"/>
               </w:rPr>
-              <w:t>Cluster RA3 (</w:t>
-            </w:r>
-            <w:proofErr w:type="gramStart"/>
-            <w:r>
-              <w:rPr>
-                <w:i/>
-                <w:iCs/>
-                <w:sz w:val="20"/>
-                <w:szCs w:val="20"/>
-              </w:rPr>
-              <w:t>ex:</w:t>
-            </w:r>
-            <w:proofErr w:type="gramEnd"/>
-            <w:r>
-              <w:rPr>
-                <w:i/>
-                <w:iCs/>
-                <w:sz w:val="20"/>
-                <w:szCs w:val="20"/>
-              </w:rPr>
-              <w:t xml:space="preserve"> 4 nœuds ra3.4xlarge) pour requêtes analytiques complexes sur 40 To. Métrique : ~3,00 € / </w:t>
-            </w:r>
-            <w:r>
-              <w:rPr>
-                <w:i/>
-                <w:iCs/>
-                <w:sz w:val="20"/>
-                <w:szCs w:val="20"/>
-              </w:rPr>
-              <w:lastRenderedPageBreak/>
-              <w:t>heure / nœud (~2 190 €/mois/nœud).</w:t>
+              <w:t>Cluster RA3 (ex: 4 nœuds ra3.4xlarge) pour requêtes analytiques complexes sur 40 To. Métrique : ~3,00 € / heure / nœud (~2 190 €/mois/nœud).</w:t>
             </w:r>
           </w:p>
         </w:tc>
@@ -1827,7 +1832,6 @@
                 <w:sz w:val="22"/>
                 <w:szCs w:val="22"/>
               </w:rPr>
-              <w:lastRenderedPageBreak/>
               <w:t>8</w:t>
             </w:r>
             <w:r>
@@ -2069,27 +2073,7 @@
                 <w:sz w:val="20"/>
                 <w:szCs w:val="20"/>
               </w:rPr>
-              <w:t>2 instances de réplication (</w:t>
-            </w:r>
-            <w:proofErr w:type="gramStart"/>
-            <w:r>
-              <w:rPr>
-                <w:i/>
-                <w:iCs/>
-                <w:sz w:val="20"/>
-                <w:szCs w:val="20"/>
-              </w:rPr>
-              <w:t>dms.r5.xlarge</w:t>
-            </w:r>
-            <w:proofErr w:type="gramEnd"/>
-            <w:r>
-              <w:rPr>
-                <w:i/>
-                <w:iCs/>
-                <w:sz w:val="20"/>
-                <w:szCs w:val="20"/>
-              </w:rPr>
-              <w:t>) pour maintenir le flux CDC (milliers de transactions/jour depuis l'ERP/CRM). Métrique : ~0,30 € / heure / instance.</w:t>
+              <w:t>2 instances de réplication (dms.r5.xlarge) pour maintenir le flux CDC (milliers de transactions/jour depuis l'ERP/CRM). Métrique : ~0,30 € / heure / instance.</w:t>
             </w:r>
           </w:p>
         </w:tc>
@@ -2351,27 +2335,7 @@
                 <w:sz w:val="20"/>
                 <w:szCs w:val="20"/>
               </w:rPr>
-              <w:t>Cluster de 3 instances (m</w:t>
-            </w:r>
-            <w:proofErr w:type="gramStart"/>
-            <w:r>
-              <w:rPr>
-                <w:i/>
-                <w:iCs/>
-                <w:sz w:val="20"/>
-                <w:szCs w:val="20"/>
-              </w:rPr>
-              <w:t>5.xlarge</w:t>
-            </w:r>
-            <w:proofErr w:type="gramEnd"/>
-            <w:r>
-              <w:rPr>
-                <w:i/>
-                <w:iCs/>
-                <w:sz w:val="20"/>
-                <w:szCs w:val="20"/>
-              </w:rPr>
-              <w:t>) + disques SSD EBS pour encaisser les 50 Go/mois d'IoT en temps réel. Métrique : ~0,21 € / heure / instance + stockage.</w:t>
+              <w:t>Cluster de 3 instances (m5.xlarge) + disques SSD EBS pour encaisser les 50 Go/mois d'IoT en temps réel. Métrique : ~0,21 € / heure / instance + stockage.</w:t>
             </w:r>
           </w:p>
         </w:tc>
@@ -3607,7 +3571,11 @@
         <w:t>AWS Budgets</w:t>
       </w:r>
       <w:r>
-        <w:t xml:space="preserve"> pour être notifié instantanément si les dépenses de stockage ou de ressources de calcul (Redshift/EC2) dépassent le budget alloué.</w:t>
+        <w:t xml:space="preserve"> pour être notifié instantanément </w:t>
+      </w:r>
+      <w:r>
+        <w:lastRenderedPageBreak/>
+        <w:t>si les dépenses de stockage ou de ressources de calcul (Redshift/EC2) dépassent le budget alloué.</w:t>
       </w:r>
     </w:p>
     <w:p>
@@ -3656,15 +3624,7 @@
           <w:b/>
           <w:bCs/>
         </w:rPr>
-        <w:t xml:space="preserve">~0,004 € / </w:t>
-      </w:r>
-      <w:r>
-        <w:rPr>
-          <w:b/>
-          <w:bCs/>
-        </w:rPr>
-        <w:lastRenderedPageBreak/>
-        <w:t>Go / mois</w:t>
+        <w:t>~0,004 € / Go / mois</w:t>
       </w:r>
       <w:r>
         <w:t>), ce qui permet de diviser le coût de stockage par six pour les données inactives.</w:t>

</xml_diff>